<commit_message>
Tengo que meter bien el valor R_nom.
</commit_message>
<xml_diff>
--- a/Laminación/Documentacion/datos tren/canales Genérico.docx
+++ b/Laminación/Documentacion/datos tren/canales Genérico.docx
@@ -91,21 +91,7 @@
                 <w:rStyle w:val="Hipervnculo"/>
                 <w:noProof/>
               </w:rPr>
-              <w:t>AH RE</w:t>
-            </w:r>
-            <w:r>
-              <w:rPr>
-                <w:rStyle w:val="Hipervnculo"/>
-                <w:noProof/>
-              </w:rPr>
-              <w:t>V</w:t>
-            </w:r>
-            <w:r>
-              <w:rPr>
-                <w:rStyle w:val="Hipervnculo"/>
-                <w:noProof/>
-              </w:rPr>
-              <w:t>IISAR areas</w:t>
+              <w:t>AH REVIISAR areas</w:t>
             </w:r>
             <w:r>
               <w:rPr>
@@ -1019,7 +1005,21 @@
                 <w:rStyle w:val="Hipervnculo"/>
                 <w:noProof/>
               </w:rPr>
-              <w:t>ÓVALO</w:t>
+              <w:t>ÓVA</w:t>
+            </w:r>
+            <w:r>
+              <w:rPr>
+                <w:rStyle w:val="Hipervnculo"/>
+                <w:noProof/>
+              </w:rPr>
+              <w:t>L</w:t>
+            </w:r>
+            <w:r>
+              <w:rPr>
+                <w:rStyle w:val="Hipervnculo"/>
+                <w:noProof/>
+              </w:rPr>
+              <w:t>O</w:t>
             </w:r>
             <w:r>
               <w:rPr>
@@ -1635,7 +1635,7 @@
                 <w:rStyle w:val="Hipervnculo"/>
                 <w:noProof/>
               </w:rPr>
-              <w:t>REDOND</w:t>
+              <w:t>RED</w:t>
             </w:r>
             <w:r>
               <w:rPr>
@@ -1643,6 +1643,13 @@
                 <w:noProof/>
               </w:rPr>
               <w:t>O</w:t>
+            </w:r>
+            <w:r>
+              <w:rPr>
+                <w:rStyle w:val="Hipervnculo"/>
+                <w:noProof/>
+              </w:rPr>
+              <w:t>NDO</w:t>
             </w:r>
             <w:r>
               <w:rPr>
@@ -2986,21 +2993,7 @@
                 <w:rStyle w:val="Hipervnculo"/>
                 <w:noProof/>
               </w:rPr>
-              <w:t>C27, C28</w:t>
-            </w:r>
-            <w:r>
-              <w:rPr>
-                <w:rStyle w:val="Hipervnculo"/>
-                <w:noProof/>
-              </w:rPr>
-              <w:t xml:space="preserve"> </w:t>
-            </w:r>
-            <w:r>
-              <w:rPr>
-                <w:rStyle w:val="Hipervnculo"/>
-                <w:noProof/>
-              </w:rPr>
-              <w:t>y C29</w:t>
+              <w:t>C27, C28 y C29</w:t>
             </w:r>
             <w:r>
               <w:rPr>
@@ -3976,14 +3969,9 @@
         <w:t>AH</w:t>
       </w:r>
       <w:r>
-        <w:t xml:space="preserve"> REVIISAR areas</w:t>
+        <w:t xml:space="preserve"> </w:t>
       </w:r>
       <w:bookmarkEnd w:id="0"/>
-    </w:p>
-    <w:p>
-      <w:pPr>
-        <w:ind w:left="432"/>
-      </w:pPr>
     </w:p>
     <w:tbl>
       <w:tblPr>
@@ -4021,10 +4009,10 @@
                   <v:path o:extrusionok="f" gradientshapeok="t" o:connecttype="rect"/>
                   <o:lock v:ext="edit" aspectratio="t"/>
                 </v:shapetype>
-                <v:shape id="_x0000_i1025" type="#_x0000_t75" style="width:339.7pt;height:162.9pt" o:ole="">
+                <v:shape id="_x0000_i1025" type="#_x0000_t75" style="width:339.6pt;height:163.2pt" o:ole="">
                   <v:imagedata r:id="rId8" o:title=""/>
                 </v:shape>
-                <o:OLEObject Type="Embed" ProgID="PBrush" ShapeID="_x0000_i1025" DrawAspect="Content" ObjectID="_1853368866" r:id="rId9"/>
+                <o:OLEObject Type="Embed" ProgID="PBrush" ShapeID="_x0000_i1025" DrawAspect="Content" ObjectID="_1853781252" r:id="rId9"/>
               </w:object>
             </w:r>
           </w:p>
@@ -4042,6 +4030,11 @@
       <w:bookmarkEnd w:id="1"/>
     </w:p>
     <w:p>
+      <w:pPr>
+        <w:rPr>
+          <w:rFonts w:cs="Calibri"/>
+        </w:rPr>
+      </w:pPr>
       <w:r>
         <w:t xml:space="preserve">Para resolver este perfil geométrico, estableceremos el origen de coordenadas (0,0) en la base de la pieza, justo en el eje de simetría vertical. Dado que la pieza es simétrica, analizaremos el </w:t>
       </w:r>
@@ -4066,6 +4059,21 @@
         <w:t>α</w:t>
       </w:r>
       <w:proofErr w:type="gramEnd"/>
+    </w:p>
+    <w:p>
+      <w:pPr>
+        <w:rPr>
+          <w:rFonts w:cs="Calibri"/>
+        </w:rPr>
+      </w:pPr>
+    </w:p>
+    <w:p>
+      <w:r>
+        <w:rPr>
+          <w:rFonts w:cs="Calibri"/>
+        </w:rPr>
+        <w:t>°</w:t>
+      </w:r>
     </w:p>
     <w:p>
       <w:pPr>
@@ -7521,6 +7529,7 @@
         <w:spacing w:before="0" w:beforeAutospacing="0"/>
       </w:pPr>
       <w:r>
+        <w:lastRenderedPageBreak/>
         <w:t xml:space="preserve">Circunferencia </w:t>
       </w:r>
       <w:r>
@@ -7721,7 +7730,6 @@
         </w:rPr>
       </w:pPr>
       <w:r>
-        <w:lastRenderedPageBreak/>
         <w:t xml:space="preserve">Recta </w:t>
       </w:r>
       <w:proofErr w:type="gramStart"/>
@@ -10425,6 +10433,12 @@
           <w:color w:val="7A7E85"/>
         </w:rPr>
         <w:br/>
+      </w:r>
+      <w:r>
+        <w:rPr>
+          <w:color w:val="7A7E85"/>
+        </w:rPr>
+        <w:lastRenderedPageBreak/>
         <w:t xml:space="preserve">    </w:t>
       </w:r>
       <w:r>
@@ -10477,12 +10491,6 @@
           <w:color w:val="7A7E85"/>
         </w:rPr>
         <w:br/>
-      </w:r>
-      <w:r>
-        <w:rPr>
-          <w:color w:val="7A7E85"/>
-        </w:rPr>
-        <w:lastRenderedPageBreak/>
         <w:t xml:space="preserve">    </w:t>
       </w:r>
       <w:r>
@@ -11140,10 +11148,10 @@
           <w:p>
             <w:r>
               <w:object w:dxaOrig="3456" w:dyaOrig="2508" w14:anchorId="155E38DF">
-                <v:shape id="_x0000_i1031" type="#_x0000_t75" style="width:173.1pt;height:125.55pt" o:ole="">
+                <v:shape id="_x0000_i1026" type="#_x0000_t75" style="width:173.4pt;height:125.4pt" o:ole="">
                   <v:imagedata r:id="rId10" o:title=""/>
                 </v:shape>
-                <o:OLEObject Type="Embed" ProgID="PBrush" ShapeID="_x0000_i1031" DrawAspect="Content" ObjectID="_1853368867" r:id="rId11"/>
+                <o:OLEObject Type="Embed" ProgID="PBrush" ShapeID="_x0000_i1026" DrawAspect="Content" ObjectID="_1853781253" r:id="rId11"/>
               </w:object>
             </w:r>
           </w:p>
@@ -11240,6 +11248,7 @@
       </w:pPr>
       <w:bookmarkStart w:id="13" w:name="_Toc242747189"/>
       <w:r>
+        <w:lastRenderedPageBreak/>
         <w:t>Definición de Centros y Geometría</w:t>
       </w:r>
       <w:bookmarkEnd w:id="13"/>
@@ -15774,6 +15783,7 @@
       </w:pPr>
       <w:bookmarkStart w:id="18" w:name="_Toc242747194"/>
       <w:r>
+        <w:lastRenderedPageBreak/>
         <w:t>Tabla de cilindros con óvalo</w:t>
       </w:r>
       <w:bookmarkEnd w:id="18"/>
@@ -15856,7 +15866,6 @@
           </w:tcPr>
           <w:p>
             <w:r>
-              <w:lastRenderedPageBreak/>
               <w:t>BH</w:t>
             </w:r>
           </w:p>
@@ -18669,6 +18678,7 @@
                 <w:color w:val="000000"/>
                 <w:sz w:val="22"/>
               </w:rPr>
+              <w:lastRenderedPageBreak/>
               <w:t>15-16</w:t>
             </w:r>
           </w:p>
@@ -18922,7 +18932,6 @@
                 <w:color w:val="000000"/>
                 <w:sz w:val="22"/>
               </w:rPr>
-              <w:lastRenderedPageBreak/>
               <w:t>17.5</w:t>
             </w:r>
           </w:p>
@@ -20298,6 +20307,7 @@
     </w:p>
     <w:p>
       <w:r>
+        <w:lastRenderedPageBreak/>
         <w:t xml:space="preserve">    "OV16.5–17": {"A": 25.66, "H": 7.23, "R": 15.00, "r": 1.5},</w:t>
       </w:r>
     </w:p>
@@ -20308,7 +20318,6 @@
     </w:p>
     <w:p>
       <w:r>
-        <w:lastRenderedPageBreak/>
         <w:t xml:space="preserve">    "OV18–18.5": {"A": 33.08, "H": 7.77, "R": 21.50, "r": 1.5},</w:t>
       </w:r>
     </w:p>
@@ -20449,34 +20458,34 @@
           <w:p>
             <w:r>
               <w:object w:dxaOrig="2388" w:dyaOrig="1836" w14:anchorId="7A4BDE77">
-                <v:shape id="_x0000_i1048" type="#_x0000_t75" style="width:119.55pt;height:91.85pt" o:ole="">
+                <v:shape id="_x0000_i1027" type="#_x0000_t75" style="width:119.4pt;height:91.8pt" o:ole="">
                   <v:imagedata r:id="rId12" o:title=""/>
                 </v:shape>
-                <o:OLEObject Type="Embed" ProgID="PBrush" ShapeID="_x0000_i1048" DrawAspect="Content" ObjectID="_1853368868" r:id="rId13"/>
+                <o:OLEObject Type="Embed" ProgID="PBrush" ShapeID="_x0000_i1027" DrawAspect="Content" ObjectID="_1853781254" r:id="rId13"/>
               </w:object>
             </w:r>
           </w:p>
           <w:p>
             <w:r>
-              <w:t>R=55</w:t>
+              <w:t>B=120.09</w:t>
             </w:r>
           </w:p>
           <w:p>
             <w:r>
-              <w:t>r</w:t>
-            </w:r>
-            <w:r>
-              <w:t>=8</w:t>
+              <w:t>H=49</w:t>
             </w:r>
           </w:p>
           <w:p>
             <w:r>
-              <w:t>A=120.09</w:t>
+              <w:t>R=55</w:t>
             </w:r>
           </w:p>
           <w:p>
             <w:r>
-              <w:t>H=49</w:t>
+              <w:t>r</w:t>
+            </w:r>
+            <w:r>
+              <w:t>=8</w:t>
             </w:r>
           </w:p>
           <w:p>
@@ -25661,10 +25670,10 @@
           <w:p>
             <w:r>
               <w:object w:dxaOrig="4932" w:dyaOrig="3732" w14:anchorId="51B79C46">
-                <v:shape id="_x0000_i1027" type="#_x0000_t75" style="width:247.4pt;height:186.9pt" o:ole="">
+                <v:shape id="_x0000_i1028" type="#_x0000_t75" style="width:247.2pt;height:187.2pt" o:ole="">
                   <v:imagedata r:id="rId14" o:title=""/>
                 </v:shape>
-                <o:OLEObject Type="Embed" ProgID="PBrush" ShapeID="_x0000_i1027" DrawAspect="Content" ObjectID="_1853368869" r:id="rId15"/>
+                <o:OLEObject Type="Embed" ProgID="PBrush" ShapeID="_x0000_i1028" DrawAspect="Content" ObjectID="_1853781255" r:id="rId15"/>
               </w:object>
             </w:r>
           </w:p>
@@ -37910,7 +37919,7 @@
     <w:p>
       <w:r>
         <w:pict w14:anchorId="7A52DC30">
-          <v:rect id="_x0000_i1028" style="width:0;height:1.5pt" o:hralign="center" o:hrstd="t" o:hr="t" fillcolor="#a0a0a0" stroked="f"/>
+          <v:rect id="_x0000_i1029" style="width:0;height:1.5pt" o:hralign="center" o:hrstd="t" o:hr="t" fillcolor="#a0a0a0" stroked="f"/>
         </w:pict>
       </w:r>
     </w:p>
@@ -42931,32 +42940,31 @@
       </w:r>
     </w:p>
     <w:p>
-      <w:r>
-        <w:t xml:space="preserve">    8: {"ALTURA": 33.0,</w:t>
-      </w:r>
-      <w:r>
-        <w:t xml:space="preserve"> “ANCHO”: </w:t>
-      </w:r>
-      <w:proofErr w:type="spellStart"/>
-      <w:proofErr w:type="gramStart"/>
-      <w:r>
-        <w:t>None</w:t>
-      </w:r>
-      <w:proofErr w:type="spellEnd"/>
-      <w:r>
-        <w:t xml:space="preserve"> ,</w:t>
-      </w:r>
-      <w:proofErr w:type="gramEnd"/>
-      <w:r>
-        <w:t xml:space="preserve"> "TOLERANCIA": </w:t>
-      </w:r>
-      <w:proofErr w:type="spellStart"/>
-      <w:r>
-        <w:t>None</w:t>
-      </w:r>
-      <w:proofErr w:type="spellEnd"/>
-      <w:r>
-        <w:t>, "LUZ": 9},</w:t>
+      <w:pPr>
+        <w:rPr>
+          <w:lang w:val="it-IT"/>
+        </w:rPr>
+      </w:pPr>
+      <w:r>
+        <w:t xml:space="preserve">    </w:t>
+      </w:r>
+      <w:r>
+        <w:rPr>
+          <w:lang w:val="it-IT"/>
+        </w:rPr>
+        <w:t>8: {"ALTURA": 33.0,</w:t>
+      </w:r>
+      <w:r>
+        <w:rPr>
+          <w:lang w:val="it-IT"/>
+        </w:rPr>
+        <w:t xml:space="preserve"> “ANCHO”: None ,</w:t>
+      </w:r>
+      <w:r>
+        <w:rPr>
+          <w:lang w:val="it-IT"/>
+        </w:rPr>
+        <w:t xml:space="preserve"> "TOLERANCIA": None, "LUZ": 9},</w:t>
       </w:r>
     </w:p>
     <w:p>
@@ -42966,6 +42974,9 @@
         </w:rPr>
       </w:pPr>
       <w:r>
+        <w:rPr>
+          <w:lang w:val="it-IT"/>
+        </w:rPr>
         <w:t xml:space="preserve">    </w:t>
       </w:r>
       <w:r>

</xml_diff>